<commit_message>
Drop Pre-Thesis 2 references and thin out the citations
The report no longer mentions the Pre-Thesis 2 panel anywhere: the
requirements, the schedule notes, the retrieval experiment and Section 5.6.3
now state the question or the objection directly instead of attributing it.

Citations are cut from 250 occurrences to 150: a source is cited where its
claim is made, not every time the same model, dataset, tool or statistical
test is mentioned again. Density is now about one citation per 190 words
(Chapter 3 one per 310, Chapter 5 one per 366), against one per 142 to 426 in
the five sample reports. The reference list is unchanged at 49 entries.

Co-Authored-By: Claude Opus 5 (1M context) <noreply@anthropic.com>
</commit_message>
<xml_diff>
--- a/final writing/Appendix.docx
+++ b/final writing/Appendix.docx
@@ -23,7 +23,7 @@
         <w:spacing w:after="120"/>
       </w:pPr>
       <w:r>
-        <w:t>The system was implemented in Python 3.10 using PyTorch 2.5.1 [44] and Hugging Face Transformers 5.16.1 [43]. Transformers provides pre-trained encoders, namely RoBERTa [6], BERT [5] and ELECTRA, and instruction-tuned decoders, namely Phi-4-mini [21], Qwen2.5 [22] and Gemma-3, behind a common interface, which allowed design alternatives to be exchanged without rewriting code. The bitsandbytes library provided 4-bit NF4 quantisation [23], allowing generators of 3.8 to 7.6 billion parameters to run on a single NVIDIA GeForce RTX 4060 with 8 GB of memory [38], and the PEFT library provided LoRA [24] for the monolithic fine-tuning baseline.</w:t>
+        <w:t>The system was implemented in Python 3.10 using PyTorch 2.5.1 and Hugging Face Transformers 5.16.1. Transformers provides pre-trained encoders, namely RoBERTa, BERT and ELECTRA, and instruction-tuned decoders, namely Phi-4-mini, Qwen2.5 and Gemma-3, behind a common interface, which allowed design alternatives to be exchanged without rewriting code. The bitsandbytes library provided 4-bit NF4 quantisation, allowing generators of 3.8 to 7.6 billion parameters to run on a single NVIDIA GeForce RTX 4060 with 8 GB of memory, and the PEFT library provided LoRA for the monolithic fine-tuning baseline.</w:t>
       </w:r>
     </w:p>
     <w:p>
@@ -31,7 +31,7 @@
         <w:spacing w:after="120"/>
       </w:pPr>
       <w:r>
-        <w:t>Evaluation combined SciPy [45] and scikit-learn [46] for paired statistical tests and classification metrics, sentence-transformers [26] for the retrieval baseline, the WASSA 2024 empathy classifier [17], and two AI judges accessed through the OpenRouter and Groq APIs, selected from different developers to avoid self-preference bias [37]. A Gradio interface was prepared for demonstration on Hugging Face Spaces, the human study was conducted with Google Forms, and all tables and figures in this report were generated from saved experiment outputs by scripts using pandas and matplotlib, so that every reported number can be reproduced.</w:t>
+        <w:t>Evaluation combined SciPy and scikit-learn for paired statistical tests and classification metrics, sentence-transformers for the retrieval baseline, the WASSA 2024 empathy classifier, and two AI judges accessed through the OpenRouter and Groq APIs, selected from different developers to avoid self-preference bias. A Gradio interface was prepared for demonstration on Hugging Face Spaces, the human study was conducted with Google Forms, and all tables and figures in this report were generated from saved experiment outputs by scripts using pandas and matplotlib, so that every reported number can be reproduced.</w:t>
       </w:r>
     </w:p>
     <w:p>

</xml_diff>

<commit_message>
Rebuild the human-evaluation form as a rating study
Supervisor's revision: every reply is now rated 1-5 on empathy/emotional
validation, contextual relevance and supportiveness instead of the rater
choosing one winner, and one preference question per situation is kept so a
head-to-head win rate is still available. The two attention-check decoys are
replaced by the real third system, and the form is cut from 13 situations to
8 because nine ratings per situation would otherwise make it a 25-minute
questionnaire. Target is 20-30 serious respondents.

Adds an Apps Script that builds all 80 questions in Google Forms, the full
item text, and a new answer key. Thesis sections 3.4.3, 5.1.9 and 5.4.8 and
the two human-evaluation tables now describe this study.

Co-Authored-By: Claude Opus 5 (1M context) <noreply@anthropic.com>
</commit_message>
<xml_diff>
--- a/final writing/Appendix.docx
+++ b/final writing/Appendix.docx
@@ -2927,16 +2927,15 @@
         <w:tblLook w:firstColumn="1" w:firstRow="1" w:lastColumn="0" w:lastRow="0" w:noHBand="0" w:noVBand="1" w:val="04A0"/>
       </w:tblPr>
       <w:tblGrid>
-        <w:gridCol w:w="1872"/>
-        <w:gridCol w:w="1872"/>
-        <w:gridCol w:w="1872"/>
-        <w:gridCol w:w="1872"/>
-        <w:gridCol w:w="1872"/>
+        <w:gridCol w:w="2340"/>
+        <w:gridCol w:w="2340"/>
+        <w:gridCol w:w="2340"/>
+        <w:gridCol w:w="2340"/>
       </w:tblGrid>
       <w:tr>
         <w:tc>
           <w:tcPr>
-            <w:tcW w:type="dxa" w:w="1872"/>
+            <w:tcW w:type="dxa" w:w="2340"/>
             <w:shd w:val="clear" w:color="auto" w:fill="E3EEFB"/>
           </w:tcPr>
           <w:p>
@@ -2950,13 +2949,13 @@
                 <w:b/>
                 <w:sz w:val="16"/>
               </w:rPr>
-              <w:t>item_number</w:t>
-            </w:r>
-          </w:p>
-        </w:tc>
-        <w:tc>
-          <w:tcPr>
-            <w:tcW w:type="dxa" w:w="1872"/>
+              <w:t>Item</w:t>
+            </w:r>
+          </w:p>
+        </w:tc>
+        <w:tc>
+          <w:tcPr>
+            <w:tcW w:type="dxa" w:w="2340"/>
             <w:shd w:val="clear" w:color="auto" w:fill="E3EEFB"/>
           </w:tcPr>
           <w:p>
@@ -2970,13 +2969,13 @@
                 <w:b/>
                 <w:sz w:val="16"/>
               </w:rPr>
-              <w:t>gold_emotion</w:t>
-            </w:r>
-          </w:p>
-        </w:tc>
-        <w:tc>
-          <w:tcPr>
-            <w:tcW w:type="dxa" w:w="1872"/>
+              <w:t>Emotion</w:t>
+            </w:r>
+          </w:p>
+        </w:tc>
+        <w:tc>
+          <w:tcPr>
+            <w:tcW w:type="dxa" w:w="2340"/>
             <w:shd w:val="clear" w:color="auto" w:fill="E3EEFB"/>
           </w:tcPr>
           <w:p>
@@ -2990,13 +2989,13 @@
                 <w:b/>
                 <w:sz w:val="16"/>
               </w:rPr>
-              <w:t>is_attention_check</w:t>
-            </w:r>
-          </w:p>
-        </w:tc>
-        <w:tc>
-          <w:tcPr>
-            <w:tcW w:type="dxa" w:w="1872"/>
+              <w:t>Scored by the AI judges</w:t>
+            </w:r>
+          </w:p>
+        </w:tc>
+        <w:tc>
+          <w:tcPr>
+            <w:tcW w:type="dxa" w:w="2340"/>
             <w:shd w:val="clear" w:color="auto" w:fill="E3EEFB"/>
           </w:tcPr>
           <w:p>
@@ -3010,27 +3009,7 @@
                 <w:b/>
                 <w:sz w:val="16"/>
               </w:rPr>
-              <w:t>ai_judge_scored</w:t>
-            </w:r>
-          </w:p>
-        </w:tc>
-        <w:tc>
-          <w:tcPr>
-            <w:tcW w:type="dxa" w:w="1872"/>
-            <w:shd w:val="clear" w:color="auto" w:fill="E3EEFB"/>
-          </w:tcPr>
-          <w:p>
-            <w:r>
-              <w:rPr>
-                <w:b/>
-              </w:rPr>
-            </w:r>
-            <w:r>
-              <w:rPr>
-                <w:b/>
-                <w:sz w:val="16"/>
-              </w:rPr>
-              <w:t>student_situation</w:t>
+              <w:t>Situation type</w:t>
             </w:r>
           </w:p>
         </w:tc>
@@ -3038,7 +3017,7 @@
       <w:tr>
         <w:tc>
           <w:tcPr>
-            <w:tcW w:type="dxa" w:w="1872"/>
+            <w:tcW w:type="dxa" w:w="2340"/>
           </w:tcPr>
           <w:p>
             <w:r/>
@@ -3052,35 +3031,21 @@
         </w:tc>
         <w:tc>
           <w:tcPr>
-            <w:tcW w:type="dxa" w:w="1872"/>
-          </w:tcPr>
-          <w:p>
-            <w:r/>
-            <w:r>
-              <w:rPr>
-                <w:sz w:val="16"/>
-              </w:rPr>
-              <w:t>joyful</w:t>
-            </w:r>
-          </w:p>
-        </w:tc>
-        <w:tc>
-          <w:tcPr>
-            <w:tcW w:type="dxa" w:w="1872"/>
-          </w:tcPr>
-          <w:p>
-            <w:r/>
-            <w:r>
-              <w:rPr>
-                <w:sz w:val="16"/>
-              </w:rPr>
-              <w:t>False</w:t>
-            </w:r>
-          </w:p>
-        </w:tc>
-        <w:tc>
-          <w:tcPr>
-            <w:tcW w:type="dxa" w:w="1872"/>
+            <w:tcW w:type="dxa" w:w="2340"/>
+          </w:tcPr>
+          <w:p>
+            <w:r/>
+            <w:r>
+              <w:rPr>
+                <w:sz w:val="16"/>
+              </w:rPr>
+              <w:t>anxious</w:t>
+            </w:r>
+          </w:p>
+        </w:tc>
+        <w:tc>
+          <w:tcPr>
+            <w:tcW w:type="dxa" w:w="2340"/>
           </w:tcPr>
           <w:p>
             <w:r/>
@@ -3094,15 +3059,15 @@
         </w:tc>
         <w:tc>
           <w:tcPr>
-            <w:tcW w:type="dxa" w:w="1872"/>
-          </w:tcPr>
-          <w:p>
-            <w:r/>
-            <w:r>
-              <w:rPr>
-                <w:sz w:val="16"/>
-              </w:rPr>
-              <w:t>False</w:t>
+            <w:tcW w:type="dxa" w:w="2340"/>
+          </w:tcPr>
+          <w:p>
+            <w:r/>
+            <w:r>
+              <w:rPr>
+                <w:sz w:val="16"/>
+              </w:rPr>
+              <w:t>core supportive emotion</w:t>
             </w:r>
           </w:p>
         </w:tc>
@@ -3110,7 +3075,7 @@
       <w:tr>
         <w:tc>
           <w:tcPr>
-            <w:tcW w:type="dxa" w:w="1872"/>
+            <w:tcW w:type="dxa" w:w="2340"/>
           </w:tcPr>
           <w:p>
             <w:r/>
@@ -3124,49 +3089,21 @@
         </w:tc>
         <w:tc>
           <w:tcPr>
-            <w:tcW w:type="dxa" w:w="1872"/>
-          </w:tcPr>
-          <w:p>
-            <w:r/>
-            <w:r>
-              <w:rPr>
-                <w:sz w:val="16"/>
-              </w:rPr>
-              <w:t>nostalgic</w:t>
-            </w:r>
-          </w:p>
-        </w:tc>
-        <w:tc>
-          <w:tcPr>
-            <w:tcW w:type="dxa" w:w="1872"/>
-          </w:tcPr>
-          <w:p>
-            <w:r/>
-            <w:r>
-              <w:rPr>
-                <w:sz w:val="16"/>
-              </w:rPr>
-              <w:t>True</w:t>
-            </w:r>
-          </w:p>
-        </w:tc>
-        <w:tc>
-          <w:tcPr>
-            <w:tcW w:type="dxa" w:w="1872"/>
-          </w:tcPr>
-          <w:p>
-            <w:r/>
-            <w:r>
-              <w:rPr>
-                <w:sz w:val="16"/>
-              </w:rPr>
-              <w:t>True</w:t>
-            </w:r>
-          </w:p>
-        </w:tc>
-        <w:tc>
-          <w:tcPr>
-            <w:tcW w:type="dxa" w:w="1872"/>
+            <w:tcW w:type="dxa" w:w="2340"/>
+          </w:tcPr>
+          <w:p>
+            <w:r/>
+            <w:r>
+              <w:rPr>
+                <w:sz w:val="16"/>
+              </w:rPr>
+              <w:t>anticipating</w:t>
+            </w:r>
+          </w:p>
+        </w:tc>
+        <w:tc>
+          <w:tcPr>
+            <w:tcW w:type="dxa" w:w="2340"/>
           </w:tcPr>
           <w:p>
             <w:r/>
@@ -3175,6 +3112,20 @@
                 <w:sz w:val="16"/>
               </w:rPr>
               <w:t>False</w:t>
+            </w:r>
+          </w:p>
+        </w:tc>
+        <w:tc>
+          <w:tcPr>
+            <w:tcW w:type="dxa" w:w="2340"/>
+          </w:tcPr>
+          <w:p>
+            <w:r/>
+            <w:r>
+              <w:rPr>
+                <w:sz w:val="16"/>
+              </w:rPr>
+              <w:t>student situation</w:t>
             </w:r>
           </w:p>
         </w:tc>
@@ -3182,7 +3133,7 @@
       <w:tr>
         <w:tc>
           <w:tcPr>
-            <w:tcW w:type="dxa" w:w="1872"/>
+            <w:tcW w:type="dxa" w:w="2340"/>
           </w:tcPr>
           <w:p>
             <w:r/>
@@ -3196,35 +3147,21 @@
         </w:tc>
         <w:tc>
           <w:tcPr>
-            <w:tcW w:type="dxa" w:w="1872"/>
-          </w:tcPr>
-          <w:p>
-            <w:r/>
-            <w:r>
-              <w:rPr>
-                <w:sz w:val="16"/>
-              </w:rPr>
-              <w:t>faithful</w:t>
-            </w:r>
-          </w:p>
-        </w:tc>
-        <w:tc>
-          <w:tcPr>
-            <w:tcW w:type="dxa" w:w="1872"/>
-          </w:tcPr>
-          <w:p>
-            <w:r/>
-            <w:r>
-              <w:rPr>
-                <w:sz w:val="16"/>
-              </w:rPr>
-              <w:t>False</w:t>
-            </w:r>
-          </w:p>
-        </w:tc>
-        <w:tc>
-          <w:tcPr>
-            <w:tcW w:type="dxa" w:w="1872"/>
+            <w:tcW w:type="dxa" w:w="2340"/>
+          </w:tcPr>
+          <w:p>
+            <w:r/>
+            <w:r>
+              <w:rPr>
+                <w:sz w:val="16"/>
+              </w:rPr>
+              <w:t>content</w:t>
+            </w:r>
+          </w:p>
+        </w:tc>
+        <w:tc>
+          <w:tcPr>
+            <w:tcW w:type="dxa" w:w="2340"/>
           </w:tcPr>
           <w:p>
             <w:r/>
@@ -3238,15 +3175,15 @@
         </w:tc>
         <w:tc>
           <w:tcPr>
-            <w:tcW w:type="dxa" w:w="1872"/>
-          </w:tcPr>
-          <w:p>
-            <w:r/>
-            <w:r>
-              <w:rPr>
-                <w:sz w:val="16"/>
-              </w:rPr>
-              <w:t>False</w:t>
+            <w:tcW w:type="dxa" w:w="2340"/>
+          </w:tcPr>
+          <w:p>
+            <w:r/>
+            <w:r>
+              <w:rPr>
+                <w:sz w:val="16"/>
+              </w:rPr>
+              <w:t>positive emotion</w:t>
             </w:r>
           </w:p>
         </w:tc>
@@ -3254,7 +3191,7 @@
       <w:tr>
         <w:tc>
           <w:tcPr>
-            <w:tcW w:type="dxa" w:w="1872"/>
+            <w:tcW w:type="dxa" w:w="2340"/>
           </w:tcPr>
           <w:p>
             <w:r/>
@@ -3268,21 +3205,21 @@
         </w:tc>
         <w:tc>
           <w:tcPr>
-            <w:tcW w:type="dxa" w:w="1872"/>
-          </w:tcPr>
-          <w:p>
-            <w:r/>
-            <w:r>
-              <w:rPr>
-                <w:sz w:val="16"/>
-              </w:rPr>
-              <w:t>angry</w:t>
-            </w:r>
-          </w:p>
-        </w:tc>
-        <w:tc>
-          <w:tcPr>
-            <w:tcW w:type="dxa" w:w="1872"/>
+            <w:tcW w:type="dxa" w:w="2340"/>
+          </w:tcPr>
+          <w:p>
+            <w:r/>
+            <w:r>
+              <w:rPr>
+                <w:sz w:val="16"/>
+              </w:rPr>
+              <w:t>prepared</w:t>
+            </w:r>
+          </w:p>
+        </w:tc>
+        <w:tc>
+          <w:tcPr>
+            <w:tcW w:type="dxa" w:w="2340"/>
           </w:tcPr>
           <w:p>
             <w:r/>
@@ -3296,29 +3233,15 @@
         </w:tc>
         <w:tc>
           <w:tcPr>
-            <w:tcW w:type="dxa" w:w="1872"/>
-          </w:tcPr>
-          <w:p>
-            <w:r/>
-            <w:r>
-              <w:rPr>
-                <w:sz w:val="16"/>
-              </w:rPr>
-              <w:t>True</w:t>
-            </w:r>
-          </w:p>
-        </w:tc>
-        <w:tc>
-          <w:tcPr>
-            <w:tcW w:type="dxa" w:w="1872"/>
-          </w:tcPr>
-          <w:p>
-            <w:r/>
-            <w:r>
-              <w:rPr>
-                <w:sz w:val="16"/>
-              </w:rPr>
-              <w:t>False</w:t>
+            <w:tcW w:type="dxa" w:w="2340"/>
+          </w:tcPr>
+          <w:p>
+            <w:r/>
+            <w:r>
+              <w:rPr>
+                <w:sz w:val="16"/>
+              </w:rPr>
+              <w:t>student situation</w:t>
             </w:r>
           </w:p>
         </w:tc>
@@ -3326,7 +3249,7 @@
       <w:tr>
         <w:tc>
           <w:tcPr>
-            <w:tcW w:type="dxa" w:w="1872"/>
+            <w:tcW w:type="dxa" w:w="2340"/>
           </w:tcPr>
           <w:p>
             <w:r/>
@@ -3340,49 +3263,21 @@
         </w:tc>
         <w:tc>
           <w:tcPr>
-            <w:tcW w:type="dxa" w:w="1872"/>
-          </w:tcPr>
-          <w:p>
-            <w:r/>
-            <w:r>
-              <w:rPr>
-                <w:sz w:val="16"/>
-              </w:rPr>
-              <w:t>prepared</w:t>
-            </w:r>
-          </w:p>
-        </w:tc>
-        <w:tc>
-          <w:tcPr>
-            <w:tcW w:type="dxa" w:w="1872"/>
-          </w:tcPr>
-          <w:p>
-            <w:r/>
-            <w:r>
-              <w:rPr>
-                <w:sz w:val="16"/>
-              </w:rPr>
-              <w:t>False</w:t>
-            </w:r>
-          </w:p>
-        </w:tc>
-        <w:tc>
-          <w:tcPr>
-            <w:tcW w:type="dxa" w:w="1872"/>
-          </w:tcPr>
-          <w:p>
-            <w:r/>
-            <w:r>
-              <w:rPr>
-                <w:sz w:val="16"/>
-              </w:rPr>
-              <w:t>False</w:t>
-            </w:r>
-          </w:p>
-        </w:tc>
-        <w:tc>
-          <w:tcPr>
-            <w:tcW w:type="dxa" w:w="1872"/>
+            <w:tcW w:type="dxa" w:w="2340"/>
+          </w:tcPr>
+          <w:p>
+            <w:r/>
+            <w:r>
+              <w:rPr>
+                <w:sz w:val="16"/>
+              </w:rPr>
+              <w:t>lonely</w:t>
+            </w:r>
+          </w:p>
+        </w:tc>
+        <w:tc>
+          <w:tcPr>
+            <w:tcW w:type="dxa" w:w="2340"/>
           </w:tcPr>
           <w:p>
             <w:r/>
@@ -3391,6 +3286,20 @@
                 <w:sz w:val="16"/>
               </w:rPr>
               <w:t>True</w:t>
+            </w:r>
+          </w:p>
+        </w:tc>
+        <w:tc>
+          <w:tcPr>
+            <w:tcW w:type="dxa" w:w="2340"/>
+          </w:tcPr>
+          <w:p>
+            <w:r/>
+            <w:r>
+              <w:rPr>
+                <w:sz w:val="16"/>
+              </w:rPr>
+              <w:t>core supportive emotion</w:t>
             </w:r>
           </w:p>
         </w:tc>
@@ -3398,7 +3307,7 @@
       <w:tr>
         <w:tc>
           <w:tcPr>
-            <w:tcW w:type="dxa" w:w="1872"/>
+            <w:tcW w:type="dxa" w:w="2340"/>
           </w:tcPr>
           <w:p>
             <w:r/>
@@ -3412,35 +3321,21 @@
         </w:tc>
         <w:tc>
           <w:tcPr>
-            <w:tcW w:type="dxa" w:w="1872"/>
-          </w:tcPr>
-          <w:p>
-            <w:r/>
-            <w:r>
-              <w:rPr>
-                <w:sz w:val="16"/>
-              </w:rPr>
-              <w:t>anxious</w:t>
-            </w:r>
-          </w:p>
-        </w:tc>
-        <w:tc>
-          <w:tcPr>
-            <w:tcW w:type="dxa" w:w="1872"/>
-          </w:tcPr>
-          <w:p>
-            <w:r/>
-            <w:r>
-              <w:rPr>
-                <w:sz w:val="16"/>
-              </w:rPr>
-              <w:t>False</w:t>
-            </w:r>
-          </w:p>
-        </w:tc>
-        <w:tc>
-          <w:tcPr>
-            <w:tcW w:type="dxa" w:w="1872"/>
+            <w:tcW w:type="dxa" w:w="2340"/>
+          </w:tcPr>
+          <w:p>
+            <w:r/>
+            <w:r>
+              <w:rPr>
+                <w:sz w:val="16"/>
+              </w:rPr>
+              <w:t>angry</w:t>
+            </w:r>
+          </w:p>
+        </w:tc>
+        <w:tc>
+          <w:tcPr>
+            <w:tcW w:type="dxa" w:w="2340"/>
           </w:tcPr>
           <w:p>
             <w:r/>
@@ -3454,15 +3349,15 @@
         </w:tc>
         <w:tc>
           <w:tcPr>
-            <w:tcW w:type="dxa" w:w="1872"/>
-          </w:tcPr>
-          <w:p>
-            <w:r/>
-            <w:r>
-              <w:rPr>
-                <w:sz w:val="16"/>
-              </w:rPr>
-              <w:t>False</w:t>
+            <w:tcW w:type="dxa" w:w="2340"/>
+          </w:tcPr>
+          <w:p>
+            <w:r/>
+            <w:r>
+              <w:rPr>
+                <w:sz w:val="16"/>
+              </w:rPr>
+              <w:t>core supportive emotion</w:t>
             </w:r>
           </w:p>
         </w:tc>
@@ -3470,7 +3365,7 @@
       <w:tr>
         <w:tc>
           <w:tcPr>
-            <w:tcW w:type="dxa" w:w="1872"/>
+            <w:tcW w:type="dxa" w:w="2340"/>
           </w:tcPr>
           <w:p>
             <w:r/>
@@ -3484,7 +3379,7 @@
         </w:tc>
         <w:tc>
           <w:tcPr>
-            <w:tcW w:type="dxa" w:w="1872"/>
+            <w:tcW w:type="dxa" w:w="2340"/>
           </w:tcPr>
           <w:p>
             <w:r/>
@@ -3498,7 +3393,7 @@
         </w:tc>
         <w:tc>
           <w:tcPr>
-            <w:tcW w:type="dxa" w:w="1872"/>
+            <w:tcW w:type="dxa" w:w="2340"/>
           </w:tcPr>
           <w:p>
             <w:r/>
@@ -3512,29 +3407,15 @@
         </w:tc>
         <w:tc>
           <w:tcPr>
-            <w:tcW w:type="dxa" w:w="1872"/>
-          </w:tcPr>
-          <w:p>
-            <w:r/>
-            <w:r>
-              <w:rPr>
-                <w:sz w:val="16"/>
-              </w:rPr>
-              <w:t>False</w:t>
-            </w:r>
-          </w:p>
-        </w:tc>
-        <w:tc>
-          <w:tcPr>
-            <w:tcW w:type="dxa" w:w="1872"/>
-          </w:tcPr>
-          <w:p>
-            <w:r/>
-            <w:r>
-              <w:rPr>
-                <w:sz w:val="16"/>
-              </w:rPr>
-              <w:t>True</w:t>
+            <w:tcW w:type="dxa" w:w="2340"/>
+          </w:tcPr>
+          <w:p>
+            <w:r/>
+            <w:r>
+              <w:rPr>
+                <w:sz w:val="16"/>
+              </w:rPr>
+              <w:t>student situation</w:t>
             </w:r>
           </w:p>
         </w:tc>
@@ -3542,7 +3423,7 @@
       <w:tr>
         <w:tc>
           <w:tcPr>
-            <w:tcW w:type="dxa" w:w="1872"/>
+            <w:tcW w:type="dxa" w:w="2340"/>
           </w:tcPr>
           <w:p>
             <w:r/>
@@ -3556,49 +3437,21 @@
         </w:tc>
         <w:tc>
           <w:tcPr>
-            <w:tcW w:type="dxa" w:w="1872"/>
-          </w:tcPr>
-          <w:p>
-            <w:r/>
-            <w:r>
-              <w:rPr>
-                <w:sz w:val="16"/>
-              </w:rPr>
-              <w:t>anticipating</w:t>
-            </w:r>
-          </w:p>
-        </w:tc>
-        <w:tc>
-          <w:tcPr>
-            <w:tcW w:type="dxa" w:w="1872"/>
-          </w:tcPr>
-          <w:p>
-            <w:r/>
-            <w:r>
-              <w:rPr>
-                <w:sz w:val="16"/>
-              </w:rPr>
-              <w:t>False</w:t>
-            </w:r>
-          </w:p>
-        </w:tc>
-        <w:tc>
-          <w:tcPr>
-            <w:tcW w:type="dxa" w:w="1872"/>
-          </w:tcPr>
-          <w:p>
-            <w:r/>
-            <w:r>
-              <w:rPr>
-                <w:sz w:val="16"/>
-              </w:rPr>
-              <w:t>False</w:t>
-            </w:r>
-          </w:p>
-        </w:tc>
-        <w:tc>
-          <w:tcPr>
-            <w:tcW w:type="dxa" w:w="1872"/>
+            <w:tcW w:type="dxa" w:w="2340"/>
+          </w:tcPr>
+          <w:p>
+            <w:r/>
+            <w:r>
+              <w:rPr>
+                <w:sz w:val="16"/>
+              </w:rPr>
+              <w:t>sad</w:t>
+            </w:r>
+          </w:p>
+        </w:tc>
+        <w:tc>
+          <w:tcPr>
+            <w:tcW w:type="dxa" w:w="2340"/>
           </w:tcPr>
           <w:p>
             <w:r/>
@@ -3610,363 +3463,17 @@
             </w:r>
           </w:p>
         </w:tc>
-      </w:tr>
-      <w:tr>
-        <w:tc>
-          <w:tcPr>
-            <w:tcW w:type="dxa" w:w="1872"/>
-          </w:tcPr>
-          <w:p>
-            <w:r/>
-            <w:r>
-              <w:rPr>
-                <w:sz w:val="16"/>
-              </w:rPr>
-              <w:t>9</w:t>
-            </w:r>
-          </w:p>
-        </w:tc>
-        <w:tc>
-          <w:tcPr>
-            <w:tcW w:type="dxa" w:w="1872"/>
-          </w:tcPr>
-          <w:p>
-            <w:r/>
-            <w:r>
-              <w:rPr>
-                <w:sz w:val="16"/>
-              </w:rPr>
-              <w:t>lonely</w:t>
-            </w:r>
-          </w:p>
-        </w:tc>
-        <w:tc>
-          <w:tcPr>
-            <w:tcW w:type="dxa" w:w="1872"/>
-          </w:tcPr>
-          <w:p>
-            <w:r/>
-            <w:r>
-              <w:rPr>
-                <w:sz w:val="16"/>
-              </w:rPr>
-              <w:t>False</w:t>
-            </w:r>
-          </w:p>
-        </w:tc>
-        <w:tc>
-          <w:tcPr>
-            <w:tcW w:type="dxa" w:w="1872"/>
-          </w:tcPr>
-          <w:p>
-            <w:r/>
-            <w:r>
-              <w:rPr>
-                <w:sz w:val="16"/>
-              </w:rPr>
-              <w:t>True</w:t>
-            </w:r>
-          </w:p>
-        </w:tc>
-        <w:tc>
-          <w:tcPr>
-            <w:tcW w:type="dxa" w:w="1872"/>
-          </w:tcPr>
-          <w:p>
-            <w:r/>
-            <w:r>
-              <w:rPr>
-                <w:sz w:val="16"/>
-              </w:rPr>
-              <w:t>False</w:t>
-            </w:r>
-          </w:p>
-        </w:tc>
-      </w:tr>
-      <w:tr>
-        <w:tc>
-          <w:tcPr>
-            <w:tcW w:type="dxa" w:w="1872"/>
-          </w:tcPr>
-          <w:p>
-            <w:r/>
-            <w:r>
-              <w:rPr>
-                <w:sz w:val="16"/>
-              </w:rPr>
-              <w:t>10</w:t>
-            </w:r>
-          </w:p>
-        </w:tc>
-        <w:tc>
-          <w:tcPr>
-            <w:tcW w:type="dxa" w:w="1872"/>
-          </w:tcPr>
-          <w:p>
-            <w:r/>
-            <w:r>
-              <w:rPr>
-                <w:sz w:val="16"/>
-              </w:rPr>
-              <w:t>disgusted</w:t>
-            </w:r>
-          </w:p>
-        </w:tc>
-        <w:tc>
-          <w:tcPr>
-            <w:tcW w:type="dxa" w:w="1872"/>
-          </w:tcPr>
-          <w:p>
-            <w:r/>
-            <w:r>
-              <w:rPr>
-                <w:sz w:val="16"/>
-              </w:rPr>
-              <w:t>False</w:t>
-            </w:r>
-          </w:p>
-        </w:tc>
-        <w:tc>
-          <w:tcPr>
-            <w:tcW w:type="dxa" w:w="1872"/>
-          </w:tcPr>
-          <w:p>
-            <w:r/>
-            <w:r>
-              <w:rPr>
-                <w:sz w:val="16"/>
-              </w:rPr>
-              <w:t>True</w:t>
-            </w:r>
-          </w:p>
-        </w:tc>
-        <w:tc>
-          <w:tcPr>
-            <w:tcW w:type="dxa" w:w="1872"/>
-          </w:tcPr>
-          <w:p>
-            <w:r/>
-            <w:r>
-              <w:rPr>
-                <w:sz w:val="16"/>
-              </w:rPr>
-              <w:t>False</w:t>
-            </w:r>
-          </w:p>
-        </w:tc>
-      </w:tr>
-      <w:tr>
-        <w:tc>
-          <w:tcPr>
-            <w:tcW w:type="dxa" w:w="1872"/>
-          </w:tcPr>
-          <w:p>
-            <w:r/>
-            <w:r>
-              <w:rPr>
-                <w:sz w:val="16"/>
-              </w:rPr>
-              <w:t>11</w:t>
-            </w:r>
-          </w:p>
-        </w:tc>
-        <w:tc>
-          <w:tcPr>
-            <w:tcW w:type="dxa" w:w="1872"/>
-          </w:tcPr>
-          <w:p>
-            <w:r/>
-            <w:r>
-              <w:rPr>
-                <w:sz w:val="16"/>
-              </w:rPr>
-              <w:t>sad</w:t>
-            </w:r>
-          </w:p>
-        </w:tc>
-        <w:tc>
-          <w:tcPr>
-            <w:tcW w:type="dxa" w:w="1872"/>
-          </w:tcPr>
-          <w:p>
-            <w:r/>
-            <w:r>
-              <w:rPr>
-                <w:sz w:val="16"/>
-              </w:rPr>
-              <w:t>False</w:t>
-            </w:r>
-          </w:p>
-        </w:tc>
-        <w:tc>
-          <w:tcPr>
-            <w:tcW w:type="dxa" w:w="1872"/>
-          </w:tcPr>
-          <w:p>
-            <w:r/>
-            <w:r>
-              <w:rPr>
-                <w:sz w:val="16"/>
-              </w:rPr>
-              <w:t>True</w:t>
-            </w:r>
-          </w:p>
-        </w:tc>
-        <w:tc>
-          <w:tcPr>
-            <w:tcW w:type="dxa" w:w="1872"/>
-          </w:tcPr>
-          <w:p>
-            <w:r/>
-            <w:r>
-              <w:rPr>
-                <w:sz w:val="16"/>
-              </w:rPr>
-              <w:t>False</w:t>
-            </w:r>
-          </w:p>
-        </w:tc>
-      </w:tr>
-      <w:tr>
-        <w:tc>
-          <w:tcPr>
-            <w:tcW w:type="dxa" w:w="1872"/>
-          </w:tcPr>
-          <w:p>
-            <w:r/>
-            <w:r>
-              <w:rPr>
-                <w:sz w:val="16"/>
-              </w:rPr>
-              <w:t>12</w:t>
-            </w:r>
-          </w:p>
-        </w:tc>
-        <w:tc>
-          <w:tcPr>
-            <w:tcW w:type="dxa" w:w="1872"/>
-          </w:tcPr>
-          <w:p>
-            <w:r/>
-            <w:r>
-              <w:rPr>
-                <w:sz w:val="16"/>
-              </w:rPr>
-              <w:t>impressed</w:t>
-            </w:r>
-          </w:p>
-        </w:tc>
-        <w:tc>
-          <w:tcPr>
-            <w:tcW w:type="dxa" w:w="1872"/>
-          </w:tcPr>
-          <w:p>
-            <w:r/>
-            <w:r>
-              <w:rPr>
-                <w:sz w:val="16"/>
-              </w:rPr>
-              <w:t>True</w:t>
-            </w:r>
-          </w:p>
-        </w:tc>
-        <w:tc>
-          <w:tcPr>
-            <w:tcW w:type="dxa" w:w="1872"/>
-          </w:tcPr>
-          <w:p>
-            <w:r/>
-            <w:r>
-              <w:rPr>
-                <w:sz w:val="16"/>
-              </w:rPr>
-              <w:t>True</w:t>
-            </w:r>
-          </w:p>
-        </w:tc>
-        <w:tc>
-          <w:tcPr>
-            <w:tcW w:type="dxa" w:w="1872"/>
-          </w:tcPr>
-          <w:p>
-            <w:r/>
-            <w:r>
-              <w:rPr>
-                <w:sz w:val="16"/>
-              </w:rPr>
-              <w:t>False</w:t>
-            </w:r>
-          </w:p>
-        </w:tc>
-      </w:tr>
-      <w:tr>
-        <w:tc>
-          <w:tcPr>
-            <w:tcW w:type="dxa" w:w="1872"/>
-          </w:tcPr>
-          <w:p>
-            <w:r/>
-            <w:r>
-              <w:rPr>
-                <w:sz w:val="16"/>
-              </w:rPr>
-              <w:t>13</w:t>
-            </w:r>
-          </w:p>
-        </w:tc>
-        <w:tc>
-          <w:tcPr>
-            <w:tcW w:type="dxa" w:w="1872"/>
-          </w:tcPr>
-          <w:p>
-            <w:r/>
-            <w:r>
-              <w:rPr>
-                <w:sz w:val="16"/>
-              </w:rPr>
-              <w:t>content</w:t>
-            </w:r>
-          </w:p>
-        </w:tc>
-        <w:tc>
-          <w:tcPr>
-            <w:tcW w:type="dxa" w:w="1872"/>
-          </w:tcPr>
-          <w:p>
-            <w:r/>
-            <w:r>
-              <w:rPr>
-                <w:sz w:val="16"/>
-              </w:rPr>
-              <w:t>False</w:t>
-            </w:r>
-          </w:p>
-        </w:tc>
-        <w:tc>
-          <w:tcPr>
-            <w:tcW w:type="dxa" w:w="1872"/>
-          </w:tcPr>
-          <w:p>
-            <w:r/>
-            <w:r>
-              <w:rPr>
-                <w:sz w:val="16"/>
-              </w:rPr>
-              <w:t>True</w:t>
-            </w:r>
-          </w:p>
-        </w:tc>
-        <w:tc>
-          <w:tcPr>
-            <w:tcW w:type="dxa" w:w="1872"/>
-          </w:tcPr>
-          <w:p>
-            <w:r/>
-            <w:r>
-              <w:rPr>
-                <w:sz w:val="16"/>
-              </w:rPr>
-              <w:t>False</w:t>
+        <w:tc>
+          <w:tcPr>
+            <w:tcW w:type="dxa" w:w="2340"/>
+          </w:tcPr>
+          <w:p>
+            <w:r/>
+            <w:r>
+              <w:rPr>
+                <w:sz w:val="16"/>
+              </w:rPr>
+              <w:t>core supportive emotion</w:t>
             </w:r>
           </w:p>
         </w:tc>

</xml_diff>

<commit_message>
Rewrite Section 3.1 in the style of the sample reports
3.1 now opens with the technical and methodological criteria the work had to
satisfy, then gives functional and non-functional requirements as compact
lists, hardware and software requirements as labelled prose (the RTX 4060 8 GB
machine and the exact stack), data requirements (23,144 conversations, 88,687
utterances, the official splits, the 300-conversation evaluation set and the
64-conversation judge sample), and design constraints as a closing paragraph.

The cost breakdown moves to the appendix and duplicated passages in 3.3, 3.6,
3.7 and 3.8 were cut, so the chapter stays at 9 pages.

Co-Authored-By: Claude Opus 5 (1M context) <noreply@anthropic.com>
</commit_message>
<xml_diff>
--- a/final writing/Appendix.docx
+++ b/final writing/Appendix.docx
@@ -2597,14 +2597,15 @@
         <w:tblLook w:firstColumn="1" w:firstRow="1" w:lastColumn="0" w:lastRow="0" w:noHBand="0" w:noVBand="1" w:val="04A0"/>
       </w:tblPr>
       <w:tblGrid>
-        <w:gridCol w:w="3120"/>
-        <w:gridCol w:w="3120"/>
-        <w:gridCol w:w="3120"/>
+        <w:gridCol w:w="2340"/>
+        <w:gridCol w:w="2340"/>
+        <w:gridCol w:w="2340"/>
+        <w:gridCol w:w="2340"/>
       </w:tblGrid>
       <w:tr>
         <w:tc>
           <w:tcPr>
-            <w:tcW w:type="dxa" w:w="3120"/>
+            <w:tcW w:type="dxa" w:w="2340"/>
             <w:shd w:val="clear" w:color="auto" w:fill="E3EEFB"/>
           </w:tcPr>
           <w:p>
@@ -2618,13 +2619,13 @@
                 <w:b/>
                 <w:sz w:val="16"/>
               </w:rPr>
-              <w:t>Criterion</w:t>
-            </w:r>
-          </w:p>
-        </w:tc>
-        <w:tc>
-          <w:tcPr>
-            <w:tcW w:type="dxa" w:w="3120"/>
+              <w:t>Item</w:t>
+            </w:r>
+          </w:p>
+        </w:tc>
+        <w:tc>
+          <w:tcPr>
+            <w:tcW w:type="dxa" w:w="2340"/>
             <w:shd w:val="clear" w:color="auto" w:fill="E3EEFB"/>
           </w:tcPr>
           <w:p>
@@ -2638,13 +2639,13 @@
                 <w:b/>
                 <w:sz w:val="16"/>
               </w:rPr>
-              <w:t>How it was applied</w:t>
-            </w:r>
-          </w:p>
-        </w:tc>
-        <w:tc>
-          <w:tcPr>
-            <w:tcW w:type="dxa" w:w="3120"/>
+              <w:t>Details</w:t>
+            </w:r>
+          </w:p>
+        </w:tc>
+        <w:tc>
+          <w:tcPr>
+            <w:tcW w:type="dxa" w:w="2340"/>
             <w:shd w:val="clear" w:color="auto" w:fill="E3EEFB"/>
           </w:tcPr>
           <w:p>
@@ -2658,7 +2659,27 @@
                 <w:b/>
                 <w:sz w:val="16"/>
               </w:rPr>
-              <w:t>Evidence or reason</w:t>
+              <w:t>Cost (BDT)</w:t>
+            </w:r>
+          </w:p>
+        </w:tc>
+        <w:tc>
+          <w:tcPr>
+            <w:tcW w:type="dxa" w:w="2340"/>
+            <w:shd w:val="clear" w:color="auto" w:fill="E3EEFB"/>
+          </w:tcPr>
+          <w:p>
+            <w:r>
+              <w:rPr>
+                <w:b/>
+              </w:rPr>
+            </w:r>
+            <w:r>
+              <w:rPr>
+                <w:b/>
+                <w:sz w:val="16"/>
+              </w:rPr>
+              <w:t>Type</w:t>
             </w:r>
           </w:p>
         </w:tc>
@@ -2666,43 +2687,59 @@
       <w:tr>
         <w:tc>
           <w:tcPr>
-            <w:tcW w:type="dxa" w:w="3120"/>
-          </w:tcPr>
-          <w:p>
-            <w:r/>
-            <w:r>
-              <w:rPr>
-                <w:sz w:val="16"/>
-              </w:rPr>
-              <w:t>Flagship-tier capability</w:t>
-            </w:r>
-          </w:p>
-        </w:tc>
-        <w:tc>
-          <w:tcPr>
-            <w:tcW w:type="dxa" w:w="3120"/>
-          </w:tcPr>
-          <w:p>
-            <w:r/>
-            <w:r>
-              <w:rPr>
-                <w:sz w:val="16"/>
-              </w:rPr>
-              <w:t>Required by the co-supervisor; small local judges (Gemma-2-2B, Phi-3-mini) were dropped from an earlier plan</w:t>
-            </w:r>
-          </w:p>
-        </w:tc>
-        <w:tc>
-          <w:tcPr>
-            <w:tcW w:type="dxa" w:w="3120"/>
-          </w:tcPr>
-          <w:p>
-            <w:r/>
-            <w:r>
-              <w:rPr>
-                <w:sz w:val="16"/>
-              </w:rPr>
-              <w:t>Zheng et al. (2023): strong LLM judges agree with human preferences over 80% of the time</w:t>
+            <w:tcW w:type="dxa" w:w="2340"/>
+          </w:tcPr>
+          <w:p>
+            <w:r/>
+            <w:r>
+              <w:rPr>
+                <w:sz w:val="16"/>
+              </w:rPr>
+              <w:t>Hardware</w:t>
+            </w:r>
+          </w:p>
+        </w:tc>
+        <w:tc>
+          <w:tcPr>
+            <w:tcW w:type="dxa" w:w="2340"/>
+          </w:tcPr>
+          <w:p>
+            <w:r/>
+            <w:r>
+              <w:rPr>
+                <w:sz w:val="16"/>
+              </w:rPr>
+              <w:t>Personal PC with RTX 4060 8 GB, 16 GB RAM (already owned)</w:t>
+            </w:r>
+          </w:p>
+        </w:tc>
+        <w:tc>
+          <w:tcPr>
+            <w:tcW w:type="dxa" w:w="2340"/>
+          </w:tcPr>
+          <w:p>
+            <w:r/>
+            <w:r>
+              <w:rPr>
+                <w:b/>
+                <w:color w:val="B03A00"/>
+                <w:sz w:val="16"/>
+              </w:rPr>
+              <w:t>[[TEAM TO FILL - BDT purchase price, or 'existing asset']]</w:t>
+            </w:r>
+          </w:p>
+        </w:tc>
+        <w:tc>
+          <w:tcPr>
+            <w:tcW w:type="dxa" w:w="2340"/>
+          </w:tcPr>
+          <w:p>
+            <w:r/>
+            <w:r>
+              <w:rPr>
+                <w:sz w:val="16"/>
+              </w:rPr>
+              <w:t>One-time</w:t>
             </w:r>
           </w:p>
         </w:tc>
@@ -2710,43 +2747,59 @@
       <w:tr>
         <w:tc>
           <w:tcPr>
-            <w:tcW w:type="dxa" w:w="3120"/>
-          </w:tcPr>
-          <w:p>
-            <w:r/>
-            <w:r>
-              <w:rPr>
-                <w:sz w:val="16"/>
-              </w:rPr>
-              <w:t>Different developers, none related to our models</w:t>
-            </w:r>
-          </w:p>
-        </w:tc>
-        <w:tc>
-          <w:tcPr>
-            <w:tcW w:type="dxa" w:w="3120"/>
-          </w:tcPr>
-          <w:p>
-            <w:r/>
-            <w:r>
-              <w:rPr>
-                <w:sz w:val="16"/>
-              </w:rPr>
-              <w:t>No judge shares a family with the generator (Phi, Microsoft) or the baselines (Qwen, Alibaba)</w:t>
-            </w:r>
-          </w:p>
-        </w:tc>
-        <w:tc>
-          <w:tcPr>
-            <w:tcW w:type="dxa" w:w="3120"/>
-          </w:tcPr>
-          <w:p>
-            <w:r/>
-            <w:r>
-              <w:rPr>
-                <w:sz w:val="16"/>
-              </w:rPr>
-              <w:t>Panickssery et al. (2024): LLM evaluators recognise and favour their own generations</w:t>
+            <w:tcW w:type="dxa" w:w="2340"/>
+          </w:tcPr>
+          <w:p>
+            <w:r/>
+            <w:r>
+              <w:rPr>
+                <w:sz w:val="16"/>
+              </w:rPr>
+              <w:t>Electricity</w:t>
+            </w:r>
+          </w:p>
+        </w:tc>
+        <w:tc>
+          <w:tcPr>
+            <w:tcW w:type="dxa" w:w="2340"/>
+          </w:tcPr>
+          <w:p>
+            <w:r/>
+            <w:r>
+              <w:rPr>
+                <w:sz w:val="16"/>
+              </w:rPr>
+              <w:t>GPU board power 115 W (NVIDIA spec) x GPU hours x tariff</w:t>
+            </w:r>
+          </w:p>
+        </w:tc>
+        <w:tc>
+          <w:tcPr>
+            <w:tcW w:type="dxa" w:w="2340"/>
+          </w:tcPr>
+          <w:p>
+            <w:r/>
+            <w:r>
+              <w:rPr>
+                <w:b/>
+                <w:color w:val="B03A00"/>
+                <w:sz w:val="16"/>
+              </w:rPr>
+              <w:t>[[TEAM TO FILL - BDT/kWh]]</w:t>
+            </w:r>
+          </w:p>
+        </w:tc>
+        <w:tc>
+          <w:tcPr>
+            <w:tcW w:type="dxa" w:w="2340"/>
+          </w:tcPr>
+          <w:p>
+            <w:r/>
+            <w:r>
+              <w:rPr>
+                <w:sz w:val="16"/>
+              </w:rPr>
+              <w:t>Per run</w:t>
             </w:r>
           </w:p>
         </w:tc>
@@ -2754,43 +2807,57 @@
       <w:tr>
         <w:tc>
           <w:tcPr>
-            <w:tcW w:type="dxa" w:w="3120"/>
-          </w:tcPr>
-          <w:p>
-            <w:r/>
-            <w:r>
-              <w:rPr>
-                <w:sz w:val="16"/>
-              </w:rPr>
-              <w:t>A panel instead of one judge</w:t>
-            </w:r>
-          </w:p>
-        </w:tc>
-        <w:tc>
-          <w:tcPr>
-            <w:tcW w:type="dxa" w:w="3120"/>
-          </w:tcPr>
-          <w:p>
-            <w:r/>
-            <w:r>
-              <w:rPr>
-                <w:sz w:val="16"/>
-              </w:rPr>
-              <w:t>Scores averaged over the two judges that scored every system</w:t>
-            </w:r>
-          </w:p>
-        </w:tc>
-        <w:tc>
-          <w:tcPr>
-            <w:tcW w:type="dxa" w:w="3120"/>
-          </w:tcPr>
-          <w:p>
-            <w:r/>
-            <w:r>
-              <w:rPr>
-                <w:sz w:val="16"/>
-              </w:rPr>
-              <w:t>Verga et al. (2024): a panel from disjoint model families shows less intra-model bias than one large judge</w:t>
+            <w:tcW w:type="dxa" w:w="2340"/>
+          </w:tcPr>
+          <w:p>
+            <w:r/>
+            <w:r>
+              <w:rPr>
+                <w:sz w:val="16"/>
+              </w:rPr>
+              <w:t>Pretrained models</w:t>
+            </w:r>
+          </w:p>
+        </w:tc>
+        <w:tc>
+          <w:tcPr>
+            <w:tcW w:type="dxa" w:w="2340"/>
+          </w:tcPr>
+          <w:p>
+            <w:r/>
+            <w:r>
+              <w:rPr>
+                <w:sz w:val="16"/>
+              </w:rPr>
+              <w:t>RoBERTa (MIT), Phi-4-mini (MIT), Qwen2.5 (Apache-2.0), Gemma-3 (Gemma terms)</w:t>
+            </w:r>
+          </w:p>
+        </w:tc>
+        <w:tc>
+          <w:tcPr>
+            <w:tcW w:type="dxa" w:w="2340"/>
+          </w:tcPr>
+          <w:p>
+            <w:r/>
+            <w:r>
+              <w:rPr>
+                <w:sz w:val="16"/>
+              </w:rPr>
+              <w:t>0</w:t>
+            </w:r>
+          </w:p>
+        </w:tc>
+        <w:tc>
+          <w:tcPr>
+            <w:tcW w:type="dxa" w:w="2340"/>
+          </w:tcPr>
+          <w:p>
+            <w:r/>
+            <w:r>
+              <w:rPr>
+                <w:sz w:val="16"/>
+              </w:rPr>
+              <w:t>Open weights</w:t>
             </w:r>
           </w:p>
         </w:tc>
@@ -2798,43 +2865,57 @@
       <w:tr>
         <w:tc>
           <w:tcPr>
-            <w:tcW w:type="dxa" w:w="3120"/>
-          </w:tcPr>
-          <w:p>
-            <w:r/>
-            <w:r>
-              <w:rPr>
-                <w:sz w:val="16"/>
-              </w:rPr>
-              <w:t>Same judges for every system</w:t>
-            </w:r>
-          </w:p>
-        </w:tc>
-        <w:tc>
-          <w:tcPr>
-            <w:tcW w:type="dxa" w:w="3120"/>
-          </w:tcPr>
-          <w:p>
-            <w:r/>
-            <w:r>
-              <w:rPr>
-                <w:sz w:val="16"/>
-              </w:rPr>
-              <w:t>Both judges scored all 512 replies of all judged systems</w:t>
-            </w:r>
-          </w:p>
-        </w:tc>
-        <w:tc>
-          <w:tcPr>
-            <w:tcW w:type="dxa" w:w="3120"/>
-          </w:tcPr>
-          <w:p>
-            <w:r/>
-            <w:r>
-              <w:rPr>
-                <w:sz w:val="16"/>
-              </w:rPr>
-              <w:t>Mixing judge sets across systems would make the scores incomparable</w:t>
+            <w:tcW w:type="dxa" w:w="2340"/>
+          </w:tcPr>
+          <w:p>
+            <w:r/>
+            <w:r>
+              <w:rPr>
+                <w:sz w:val="16"/>
+              </w:rPr>
+              <w:t>Dataset</w:t>
+            </w:r>
+          </w:p>
+        </w:tc>
+        <w:tc>
+          <w:tcPr>
+            <w:tcW w:type="dxa" w:w="2340"/>
+          </w:tcPr>
+          <w:p>
+            <w:r/>
+            <w:r>
+              <w:rPr>
+                <w:sz w:val="16"/>
+              </w:rPr>
+              <w:t>EmpatheticDialogues (CC BY-NC 4.0)</w:t>
+            </w:r>
+          </w:p>
+        </w:tc>
+        <w:tc>
+          <w:tcPr>
+            <w:tcW w:type="dxa" w:w="2340"/>
+          </w:tcPr>
+          <w:p>
+            <w:r/>
+            <w:r>
+              <w:rPr>
+                <w:sz w:val="16"/>
+              </w:rPr>
+              <w:t>0</w:t>
+            </w:r>
+          </w:p>
+        </w:tc>
+        <w:tc>
+          <w:tcPr>
+            <w:tcW w:type="dxa" w:w="2340"/>
+          </w:tcPr>
+          <w:p>
+            <w:r/>
+            <w:r>
+              <w:rPr>
+                <w:sz w:val="16"/>
+              </w:rPr>
+              <w:t>Non-commercial use only</w:t>
             </w:r>
           </w:p>
         </w:tc>
@@ -2842,43 +2923,57 @@
       <w:tr>
         <w:tc>
           <w:tcPr>
-            <w:tcW w:type="dxa" w:w="3120"/>
-          </w:tcPr>
-          <w:p>
-            <w:r/>
-            <w:r>
-              <w:rPr>
-                <w:sz w:val="16"/>
-              </w:rPr>
-              <w:t>Blind scoring</w:t>
-            </w:r>
-          </w:p>
-        </w:tc>
-        <w:tc>
-          <w:tcPr>
-            <w:tcW w:type="dxa" w:w="3120"/>
-          </w:tcPr>
-          <w:p>
-            <w:r/>
-            <w:r>
-              <w:rPr>
-                <w:sz w:val="16"/>
-              </w:rPr>
-              <w:t>Judges see only the user message and one reply - never the system name or the gold reply</w:t>
-            </w:r>
-          </w:p>
-        </w:tc>
-        <w:tc>
-          <w:tcPr>
-            <w:tcW w:type="dxa" w:w="3120"/>
-          </w:tcPr>
-          <w:p>
-            <w:r/>
-            <w:r>
-              <w:rPr>
-                <w:sz w:val="16"/>
-              </w:rPr>
-              <w:t>Removes identity bias and any reward for word overlap with a reference reply</w:t>
+            <w:tcW w:type="dxa" w:w="2340"/>
+          </w:tcPr>
+          <w:p>
+            <w:r/>
+            <w:r>
+              <w:rPr>
+                <w:sz w:val="16"/>
+              </w:rPr>
+              <w:t>AI judges</w:t>
+            </w:r>
+          </w:p>
+        </w:tc>
+        <w:tc>
+          <w:tcPr>
+            <w:tcW w:type="dxa" w:w="2340"/>
+          </w:tcPr>
+          <w:p>
+            <w:r/>
+            <w:r>
+              <w:rPr>
+                <w:sz w:val="16"/>
+              </w:rPr>
+              <w:t>OpenRouter free tier, Groq free tier</w:t>
+            </w:r>
+          </w:p>
+        </w:tc>
+        <w:tc>
+          <w:tcPr>
+            <w:tcW w:type="dxa" w:w="2340"/>
+          </w:tcPr>
+          <w:p>
+            <w:r/>
+            <w:r>
+              <w:rPr>
+                <w:sz w:val="16"/>
+              </w:rPr>
+              <w:t>0</w:t>
+            </w:r>
+          </w:p>
+        </w:tc>
+        <w:tc>
+          <w:tcPr>
+            <w:tcW w:type="dxa" w:w="2340"/>
+          </w:tcPr>
+          <w:p>
+            <w:r/>
+            <w:r>
+              <w:rPr>
+                <w:sz w:val="16"/>
+              </w:rPr>
+              <w:t>Rate-limited</w:t>
             </w:r>
           </w:p>
         </w:tc>
@@ -2886,43 +2981,57 @@
       <w:tr>
         <w:tc>
           <w:tcPr>
-            <w:tcW w:type="dxa" w:w="3120"/>
-          </w:tcPr>
-          <w:p>
-            <w:r/>
-            <w:r>
-              <w:rPr>
-                <w:sz w:val="16"/>
-              </w:rPr>
-              <w:t>Anchored rubric, deterministic output</w:t>
-            </w:r>
-          </w:p>
-        </w:tc>
-        <w:tc>
-          <w:tcPr>
-            <w:tcW w:type="dxa" w:w="3120"/>
-          </w:tcPr>
-          <w:p>
-            <w:r/>
-            <w:r>
-              <w:rPr>
-                <w:sz w:val="16"/>
-              </w:rPr>
-              <w:t>1-3 / 4-6 / 7-10 anchors for empathy, relevance and safety; temperature 0; JSON-only answer</w:t>
-            </w:r>
-          </w:p>
-        </w:tc>
-        <w:tc>
-          <w:tcPr>
-            <w:tcW w:type="dxa" w:w="3120"/>
-          </w:tcPr>
-          <w:p>
-            <w:r/>
-            <w:r>
-              <w:rPr>
-                <w:sz w:val="16"/>
-              </w:rPr>
-              <w:t>Anchors keep judges on the same scale; temperature 0 removes sampling noise</w:t>
+            <w:tcW w:type="dxa" w:w="2340"/>
+          </w:tcPr>
+          <w:p>
+            <w:r/>
+            <w:r>
+              <w:rPr>
+                <w:sz w:val="16"/>
+              </w:rPr>
+              <w:t>Hosting (demo)</w:t>
+            </w:r>
+          </w:p>
+        </w:tc>
+        <w:tc>
+          <w:tcPr>
+            <w:tcW w:type="dxa" w:w="2340"/>
+          </w:tcPr>
+          <w:p>
+            <w:r/>
+            <w:r>
+              <w:rPr>
+                <w:sz w:val="16"/>
+              </w:rPr>
+              <w:t>Hugging Face Spaces free CPU tier (2 vCPU, 16 GB)</w:t>
+            </w:r>
+          </w:p>
+        </w:tc>
+        <w:tc>
+          <w:tcPr>
+            <w:tcW w:type="dxa" w:w="2340"/>
+          </w:tcPr>
+          <w:p>
+            <w:r/>
+            <w:r>
+              <w:rPr>
+                <w:sz w:val="16"/>
+              </w:rPr>
+              <w:t>0</w:t>
+            </w:r>
+          </w:p>
+        </w:tc>
+        <w:tc>
+          <w:tcPr>
+            <w:tcW w:type="dxa" w:w="2340"/>
+          </w:tcPr>
+          <w:p>
+            <w:r/>
+            <w:r>
+              <w:rPr>
+                <w:sz w:val="16"/>
+              </w:rPr>
+              <w:t>Not yet deployed</w:t>
             </w:r>
           </w:p>
         </w:tc>
@@ -2930,43 +3039,57 @@
       <w:tr>
         <w:tc>
           <w:tcPr>
-            <w:tcW w:type="dxa" w:w="3120"/>
-          </w:tcPr>
-          <w:p>
-            <w:r/>
-            <w:r>
-              <w:rPr>
-                <w:sz w:val="16"/>
-              </w:rPr>
-              <w:t>Free API access</w:t>
-            </w:r>
-          </w:p>
-        </w:tc>
-        <w:tc>
-          <w:tcPr>
-            <w:tcW w:type="dxa" w:w="3120"/>
-          </w:tcPr>
-          <w:p>
-            <w:r/>
-            <w:r>
-              <w:rPr>
-                <w:sz w:val="16"/>
-              </w:rPr>
-              <w:t>No GPU needed, so non-coding teammates could run the judging</w:t>
-            </w:r>
-          </w:p>
-        </w:tc>
-        <w:tc>
-          <w:tcPr>
-            <w:tcW w:type="dxa" w:w="3120"/>
-          </w:tcPr>
-          <w:p>
-            <w:r/>
-            <w:r>
-              <w:rPr>
-                <w:sz w:val="16"/>
-              </w:rPr>
-              <w:t>Project resource constraint (Section 3.8)</w:t>
+            <w:tcW w:type="dxa" w:w="2340"/>
+          </w:tcPr>
+          <w:p>
+            <w:r/>
+            <w:r>
+              <w:rPr>
+                <w:sz w:val="16"/>
+              </w:rPr>
+              <w:t>Human evaluation</w:t>
+            </w:r>
+          </w:p>
+        </w:tc>
+        <w:tc>
+          <w:tcPr>
+            <w:tcW w:type="dxa" w:w="2340"/>
+          </w:tcPr>
+          <w:p>
+            <w:r/>
+            <w:r>
+              <w:rPr>
+                <w:sz w:val="16"/>
+              </w:rPr>
+              <w:t>Google Forms, volunteer raters</w:t>
+            </w:r>
+          </w:p>
+        </w:tc>
+        <w:tc>
+          <w:tcPr>
+            <w:tcW w:type="dxa" w:w="2340"/>
+          </w:tcPr>
+          <w:p>
+            <w:r/>
+            <w:r>
+              <w:rPr>
+                <w:sz w:val="16"/>
+              </w:rPr>
+              <w:t>0</w:t>
+            </w:r>
+          </w:p>
+        </w:tc>
+        <w:tc>
+          <w:tcPr>
+            <w:tcW w:type="dxa" w:w="2340"/>
+          </w:tcPr>
+          <w:p>
+            <w:r/>
+            <w:r>
+              <w:rPr>
+                <w:sz w:val="16"/>
+              </w:rPr>
+              <w:t>No payment</w:t>
             </w:r>
           </w:p>
         </w:tc>
@@ -2974,43 +3097,59 @@
       <w:tr>
         <w:tc>
           <w:tcPr>
-            <w:tcW w:type="dxa" w:w="3120"/>
-          </w:tcPr>
-          <w:p>
-            <w:r/>
-            <w:r>
-              <w:rPr>
-                <w:sz w:val="16"/>
-              </w:rPr>
-              <w:t>Documented replacements</w:t>
-            </w:r>
-          </w:p>
-        </w:tc>
-        <w:tc>
-          <w:tcPr>
-            <w:tcW w:type="dxa" w:w="3120"/>
-          </w:tcPr>
-          <w:p>
-            <w:r/>
-            <w:r>
-              <w:rPr>
-                <w:sz w:val="16"/>
-              </w:rPr>
-              <w:t>Gemini (repeated quota failures), DeepSeek (retired on GitHub Models, removed from OpenRouter free tier), Llama 3.3 70B (decommissioned on Groq), Mistral Large (subscription tier)</w:t>
-            </w:r>
-          </w:p>
-        </w:tc>
-        <w:tc>
-          <w:tcPr>
-            <w:tcW w:type="dxa" w:w="3120"/>
-          </w:tcPr>
-          <w:p>
-            <w:r/>
-            <w:r>
-              <w:rPr>
-                <w:sz w:val="16"/>
-              </w:rPr>
-              <w:t>See risk R7 in Section 3.7</w:t>
+            <w:tcW w:type="dxa" w:w="2340"/>
+          </w:tcPr>
+          <w:p>
+            <w:r/>
+            <w:r>
+              <w:rPr>
+                <w:sz w:val="16"/>
+              </w:rPr>
+              <w:t>Internet</w:t>
+            </w:r>
+          </w:p>
+        </w:tc>
+        <w:tc>
+          <w:tcPr>
+            <w:tcW w:type="dxa" w:w="2340"/>
+          </w:tcPr>
+          <w:p>
+            <w:r/>
+            <w:r>
+              <w:rPr>
+                <w:sz w:val="16"/>
+              </w:rPr>
+              <w:t>Model downloads, API calls</w:t>
+            </w:r>
+          </w:p>
+        </w:tc>
+        <w:tc>
+          <w:tcPr>
+            <w:tcW w:type="dxa" w:w="2340"/>
+          </w:tcPr>
+          <w:p>
+            <w:r/>
+            <w:r>
+              <w:rPr>
+                <w:b/>
+                <w:color w:val="B03A00"/>
+                <w:sz w:val="16"/>
+              </w:rPr>
+              <w:t>[[TEAM TO FILL]]</w:t>
+            </w:r>
+          </w:p>
+        </w:tc>
+        <w:tc>
+          <w:tcPr>
+            <w:tcW w:type="dxa" w:w="2340"/>
+          </w:tcPr>
+          <w:p>
+            <w:r/>
+            <w:r>
+              <w:rPr>
+                <w:sz w:val="16"/>
+              </w:rPr>
+              <w:t>Monthly</w:t>
             </w:r>
           </w:p>
         </w:tc>
@@ -3025,7 +3164,445 @@
         <w:rPr>
           <w:i/>
         </w:rPr>
-        <w:t>Table A.4: Criteria for selecting the AI judges (selection criteria behind Section 4.1.5.1).</w:t>
+        <w:t>Table A.4: Development cost breakdown (item-by-item cost behind Section 3.8).</w:t>
+      </w:r>
+    </w:p>
+    <w:tbl>
+      <w:tblPr>
+        <w:tblStyle w:val="TableGrid"/>
+        <w:tblW w:type="auto" w:w="0"/>
+        <w:tblLook w:firstColumn="1" w:firstRow="1" w:lastColumn="0" w:lastRow="0" w:noHBand="0" w:noVBand="1" w:val="04A0"/>
+      </w:tblPr>
+      <w:tblGrid>
+        <w:gridCol w:w="3120"/>
+        <w:gridCol w:w="3120"/>
+        <w:gridCol w:w="3120"/>
+      </w:tblGrid>
+      <w:tr>
+        <w:tc>
+          <w:tcPr>
+            <w:tcW w:type="dxa" w:w="3120"/>
+            <w:shd w:val="clear" w:color="auto" w:fill="E3EEFB"/>
+          </w:tcPr>
+          <w:p>
+            <w:r>
+              <w:rPr>
+                <w:b/>
+              </w:rPr>
+            </w:r>
+            <w:r>
+              <w:rPr>
+                <w:b/>
+                <w:sz w:val="16"/>
+              </w:rPr>
+              <w:t>Criterion</w:t>
+            </w:r>
+          </w:p>
+        </w:tc>
+        <w:tc>
+          <w:tcPr>
+            <w:tcW w:type="dxa" w:w="3120"/>
+            <w:shd w:val="clear" w:color="auto" w:fill="E3EEFB"/>
+          </w:tcPr>
+          <w:p>
+            <w:r>
+              <w:rPr>
+                <w:b/>
+              </w:rPr>
+            </w:r>
+            <w:r>
+              <w:rPr>
+                <w:b/>
+                <w:sz w:val="16"/>
+              </w:rPr>
+              <w:t>How it was applied</w:t>
+            </w:r>
+          </w:p>
+        </w:tc>
+        <w:tc>
+          <w:tcPr>
+            <w:tcW w:type="dxa" w:w="3120"/>
+            <w:shd w:val="clear" w:color="auto" w:fill="E3EEFB"/>
+          </w:tcPr>
+          <w:p>
+            <w:r>
+              <w:rPr>
+                <w:b/>
+              </w:rPr>
+            </w:r>
+            <w:r>
+              <w:rPr>
+                <w:b/>
+                <w:sz w:val="16"/>
+              </w:rPr>
+              <w:t>Evidence or reason</w:t>
+            </w:r>
+          </w:p>
+        </w:tc>
+      </w:tr>
+      <w:tr>
+        <w:tc>
+          <w:tcPr>
+            <w:tcW w:type="dxa" w:w="3120"/>
+          </w:tcPr>
+          <w:p>
+            <w:r/>
+            <w:r>
+              <w:rPr>
+                <w:sz w:val="16"/>
+              </w:rPr>
+              <w:t>Flagship-tier capability</w:t>
+            </w:r>
+          </w:p>
+        </w:tc>
+        <w:tc>
+          <w:tcPr>
+            <w:tcW w:type="dxa" w:w="3120"/>
+          </w:tcPr>
+          <w:p>
+            <w:r/>
+            <w:r>
+              <w:rPr>
+                <w:sz w:val="16"/>
+              </w:rPr>
+              <w:t>Required by the co-supervisor; small local judges (Gemma-2-2B, Phi-3-mini) were dropped from an earlier plan</w:t>
+            </w:r>
+          </w:p>
+        </w:tc>
+        <w:tc>
+          <w:tcPr>
+            <w:tcW w:type="dxa" w:w="3120"/>
+          </w:tcPr>
+          <w:p>
+            <w:r/>
+            <w:r>
+              <w:rPr>
+                <w:sz w:val="16"/>
+              </w:rPr>
+              <w:t>Zheng et al. (2023): strong LLM judges agree with human preferences over 80% of the time</w:t>
+            </w:r>
+          </w:p>
+        </w:tc>
+      </w:tr>
+      <w:tr>
+        <w:tc>
+          <w:tcPr>
+            <w:tcW w:type="dxa" w:w="3120"/>
+          </w:tcPr>
+          <w:p>
+            <w:r/>
+            <w:r>
+              <w:rPr>
+                <w:sz w:val="16"/>
+              </w:rPr>
+              <w:t>Different developers, none related to our models</w:t>
+            </w:r>
+          </w:p>
+        </w:tc>
+        <w:tc>
+          <w:tcPr>
+            <w:tcW w:type="dxa" w:w="3120"/>
+          </w:tcPr>
+          <w:p>
+            <w:r/>
+            <w:r>
+              <w:rPr>
+                <w:sz w:val="16"/>
+              </w:rPr>
+              <w:t>No judge shares a family with the generator (Phi, Microsoft) or the baselines (Qwen, Alibaba)</w:t>
+            </w:r>
+          </w:p>
+        </w:tc>
+        <w:tc>
+          <w:tcPr>
+            <w:tcW w:type="dxa" w:w="3120"/>
+          </w:tcPr>
+          <w:p>
+            <w:r/>
+            <w:r>
+              <w:rPr>
+                <w:sz w:val="16"/>
+              </w:rPr>
+              <w:t>Panickssery et al. (2024): LLM evaluators recognise and favour their own generations</w:t>
+            </w:r>
+          </w:p>
+        </w:tc>
+      </w:tr>
+      <w:tr>
+        <w:tc>
+          <w:tcPr>
+            <w:tcW w:type="dxa" w:w="3120"/>
+          </w:tcPr>
+          <w:p>
+            <w:r/>
+            <w:r>
+              <w:rPr>
+                <w:sz w:val="16"/>
+              </w:rPr>
+              <w:t>A panel instead of one judge</w:t>
+            </w:r>
+          </w:p>
+        </w:tc>
+        <w:tc>
+          <w:tcPr>
+            <w:tcW w:type="dxa" w:w="3120"/>
+          </w:tcPr>
+          <w:p>
+            <w:r/>
+            <w:r>
+              <w:rPr>
+                <w:sz w:val="16"/>
+              </w:rPr>
+              <w:t>Scores averaged over the two judges that scored every system</w:t>
+            </w:r>
+          </w:p>
+        </w:tc>
+        <w:tc>
+          <w:tcPr>
+            <w:tcW w:type="dxa" w:w="3120"/>
+          </w:tcPr>
+          <w:p>
+            <w:r/>
+            <w:r>
+              <w:rPr>
+                <w:sz w:val="16"/>
+              </w:rPr>
+              <w:t>Verga et al. (2024): a panel from disjoint model families shows less intra-model bias than one large judge</w:t>
+            </w:r>
+          </w:p>
+        </w:tc>
+      </w:tr>
+      <w:tr>
+        <w:tc>
+          <w:tcPr>
+            <w:tcW w:type="dxa" w:w="3120"/>
+          </w:tcPr>
+          <w:p>
+            <w:r/>
+            <w:r>
+              <w:rPr>
+                <w:sz w:val="16"/>
+              </w:rPr>
+              <w:t>Same judges for every system</w:t>
+            </w:r>
+          </w:p>
+        </w:tc>
+        <w:tc>
+          <w:tcPr>
+            <w:tcW w:type="dxa" w:w="3120"/>
+          </w:tcPr>
+          <w:p>
+            <w:r/>
+            <w:r>
+              <w:rPr>
+                <w:sz w:val="16"/>
+              </w:rPr>
+              <w:t>Both judges scored all 512 replies of all judged systems</w:t>
+            </w:r>
+          </w:p>
+        </w:tc>
+        <w:tc>
+          <w:tcPr>
+            <w:tcW w:type="dxa" w:w="3120"/>
+          </w:tcPr>
+          <w:p>
+            <w:r/>
+            <w:r>
+              <w:rPr>
+                <w:sz w:val="16"/>
+              </w:rPr>
+              <w:t>Mixing judge sets across systems would make the scores incomparable</w:t>
+            </w:r>
+          </w:p>
+        </w:tc>
+      </w:tr>
+      <w:tr>
+        <w:tc>
+          <w:tcPr>
+            <w:tcW w:type="dxa" w:w="3120"/>
+          </w:tcPr>
+          <w:p>
+            <w:r/>
+            <w:r>
+              <w:rPr>
+                <w:sz w:val="16"/>
+              </w:rPr>
+              <w:t>Blind scoring</w:t>
+            </w:r>
+          </w:p>
+        </w:tc>
+        <w:tc>
+          <w:tcPr>
+            <w:tcW w:type="dxa" w:w="3120"/>
+          </w:tcPr>
+          <w:p>
+            <w:r/>
+            <w:r>
+              <w:rPr>
+                <w:sz w:val="16"/>
+              </w:rPr>
+              <w:t>Judges see only the user message and one reply - never the system name or the gold reply</w:t>
+            </w:r>
+          </w:p>
+        </w:tc>
+        <w:tc>
+          <w:tcPr>
+            <w:tcW w:type="dxa" w:w="3120"/>
+          </w:tcPr>
+          <w:p>
+            <w:r/>
+            <w:r>
+              <w:rPr>
+                <w:sz w:val="16"/>
+              </w:rPr>
+              <w:t>Removes identity bias and any reward for word overlap with a reference reply</w:t>
+            </w:r>
+          </w:p>
+        </w:tc>
+      </w:tr>
+      <w:tr>
+        <w:tc>
+          <w:tcPr>
+            <w:tcW w:type="dxa" w:w="3120"/>
+          </w:tcPr>
+          <w:p>
+            <w:r/>
+            <w:r>
+              <w:rPr>
+                <w:sz w:val="16"/>
+              </w:rPr>
+              <w:t>Anchored rubric, deterministic output</w:t>
+            </w:r>
+          </w:p>
+        </w:tc>
+        <w:tc>
+          <w:tcPr>
+            <w:tcW w:type="dxa" w:w="3120"/>
+          </w:tcPr>
+          <w:p>
+            <w:r/>
+            <w:r>
+              <w:rPr>
+                <w:sz w:val="16"/>
+              </w:rPr>
+              <w:t>1-3 / 4-6 / 7-10 anchors for empathy, relevance and safety; temperature 0; JSON-only answer</w:t>
+            </w:r>
+          </w:p>
+        </w:tc>
+        <w:tc>
+          <w:tcPr>
+            <w:tcW w:type="dxa" w:w="3120"/>
+          </w:tcPr>
+          <w:p>
+            <w:r/>
+            <w:r>
+              <w:rPr>
+                <w:sz w:val="16"/>
+              </w:rPr>
+              <w:t>Anchors keep judges on the same scale; temperature 0 removes sampling noise</w:t>
+            </w:r>
+          </w:p>
+        </w:tc>
+      </w:tr>
+      <w:tr>
+        <w:tc>
+          <w:tcPr>
+            <w:tcW w:type="dxa" w:w="3120"/>
+          </w:tcPr>
+          <w:p>
+            <w:r/>
+            <w:r>
+              <w:rPr>
+                <w:sz w:val="16"/>
+              </w:rPr>
+              <w:t>Free API access</w:t>
+            </w:r>
+          </w:p>
+        </w:tc>
+        <w:tc>
+          <w:tcPr>
+            <w:tcW w:type="dxa" w:w="3120"/>
+          </w:tcPr>
+          <w:p>
+            <w:r/>
+            <w:r>
+              <w:rPr>
+                <w:sz w:val="16"/>
+              </w:rPr>
+              <w:t>No GPU needed, so non-coding teammates could run the judging</w:t>
+            </w:r>
+          </w:p>
+        </w:tc>
+        <w:tc>
+          <w:tcPr>
+            <w:tcW w:type="dxa" w:w="3120"/>
+          </w:tcPr>
+          <w:p>
+            <w:r/>
+            <w:r>
+              <w:rPr>
+                <w:sz w:val="16"/>
+              </w:rPr>
+              <w:t>Project resource constraint (Section 3.8)</w:t>
+            </w:r>
+          </w:p>
+        </w:tc>
+      </w:tr>
+      <w:tr>
+        <w:tc>
+          <w:tcPr>
+            <w:tcW w:type="dxa" w:w="3120"/>
+          </w:tcPr>
+          <w:p>
+            <w:r/>
+            <w:r>
+              <w:rPr>
+                <w:sz w:val="16"/>
+              </w:rPr>
+              <w:t>Documented replacements</w:t>
+            </w:r>
+          </w:p>
+        </w:tc>
+        <w:tc>
+          <w:tcPr>
+            <w:tcW w:type="dxa" w:w="3120"/>
+          </w:tcPr>
+          <w:p>
+            <w:r/>
+            <w:r>
+              <w:rPr>
+                <w:sz w:val="16"/>
+              </w:rPr>
+              <w:t>Gemini (repeated quota failures), DeepSeek (retired on GitHub Models, removed from OpenRouter free tier), Llama 3.3 70B (decommissioned on Groq), Mistral Large (subscription tier)</w:t>
+            </w:r>
+          </w:p>
+        </w:tc>
+        <w:tc>
+          <w:tcPr>
+            <w:tcW w:type="dxa" w:w="3120"/>
+          </w:tcPr>
+          <w:p>
+            <w:r/>
+            <w:r>
+              <w:rPr>
+                <w:sz w:val="16"/>
+              </w:rPr>
+              <w:t>See risk R7 in Section 3.7</w:t>
+            </w:r>
+          </w:p>
+        </w:tc>
+      </w:tr>
+    </w:tbl>
+    <w:p/>
+    <w:p>
+      <w:pPr>
+        <w:spacing w:after="120"/>
+      </w:pPr>
+      <w:r>
+        <w:rPr>
+          <w:i/>
+        </w:rPr>
+        <w:t>Table A.5: Criteria for selecting the AI judges (selection criteria behind Section 4.1.5.1).</w:t>
       </w:r>
     </w:p>
     <w:tbl>
@@ -5457,7 +6034,7 @@
         <w:rPr>
           <w:i/>
         </w:rPr>
-        <w:t>Table A.5: Precision, recall and F1 of the final detector for each emotion (32 rows of per-emotion detail behind Section 5.1.2).</w:t>
+        <w:t>Table A.6: Precision, recall and F1 of the final detector for each emotion (32 rows of per-emotion detail behind Section 5.1.2).</w:t>
       </w:r>
     </w:p>
     <w:tbl>
@@ -6028,7 +6605,7 @@
         <w:rPr>
           <w:i/>
         </w:rPr>
-        <w:t>Table A.6: Design of the human-evaluation items (item-by-item design of the human study described in Section 5.1.9).</w:t>
+        <w:t>Table A.7: Design of the human-evaluation items (item-by-item design of the human study described in Section 5.1.9).</w:t>
       </w:r>
     </w:p>
     <w:tbl>
@@ -6774,7 +7351,7 @@
         <w:rPr>
           <w:i/>
         </w:rPr>
-        <w:t>Table A.7: WASSA empathy score within each reply-length band (length-band detail behind Section 5.2.3).</w:t>
+        <w:t>Table A.8: WASSA empathy score within each reply-length band (length-band detail behind Section 5.2.3).</w:t>
       </w:r>
     </w:p>
     <w:tbl>
@@ -8069,7 +8646,7 @@
         <w:rPr>
           <w:i/>
         </w:rPr>
-        <w:t>Table A.8: Paired significance tests between detector models (significance tests behind the detector comparison in Section 4.2.2).</w:t>
+        <w:t>Table A.9: Paired significance tests between detector models (significance tests behind the detector comparison in Section 4.2.2).</w:t>
       </w:r>
     </w:p>
     <w:tbl>
@@ -9250,7 +9827,7 @@
         <w:rPr>
           <w:i/>
         </w:rPr>
-        <w:t>Table A.9: Correlation between reply length and WASSA empathy score within each system (per-system correlations behind Section 5.4.5).</w:t>
+        <w:t>Table A.10: Correlation between reply length and WASSA empathy score within each system (per-system correlations behind Section 5.4.5).</w:t>
       </w:r>
     </w:p>
     <w:tbl>
@@ -9996,7 +10573,7 @@
         <w:rPr>
           <w:i/>
         </w:rPr>
-        <w:t>Table A.10: Evidence on the validity of the WASSA empathy classifier for this project (validity checks on the empathy classifier, summarised in Section 5.4.6).</w:t>
+        <w:t>Table A.11: Evidence on the validity of the WASSA empathy classifier for this project (validity checks on the empathy classifier, summarised in Section 5.4.6).</w:t>
       </w:r>
     </w:p>
     <w:tbl>
@@ -10366,7 +10943,7 @@
         <w:rPr>
           <w:i/>
         </w:rPr>
-        <w:t>Table A.11: Effect of a more accurate detector with the generator held fixed (detector-swap detail behind Section 5.5.3).</w:t>
+        <w:t>Table A.12: Effect of a more accurate detector with the generator held fixed (detector-swap detail behind Section 5.5.3).</w:t>
       </w:r>
     </w:p>
     <w:tbl>
@@ -10785,7 +11362,7 @@
         <w:rPr>
           <w:i/>
         </w:rPr>
-        <w:t>Table A.12: Detector size, detection accuracy and final-system reply quality for RoBERTa-base and RoBERTa-large (detector-level figures behind Section 5.5.7).</w:t>
+        <w:t>Table A.13: Detector size, detection accuracy and final-system reply quality for RoBERTa-base and RoBERTa-large (detector-level figures behind Section 5.5.7).</w:t>
       </w:r>
     </w:p>
     <w:tbl>
@@ -11753,7 +12330,7 @@
         <w:rPr>
           <w:i/>
         </w:rPr>
-        <w:t>Table A.13: Paired comparison of response time and memory between the final system and each single model (paired tests behind the resource figures in Section 5.5.7).</w:t>
+        <w:t>Table A.14: Paired comparison of response time and memory between the final system and each single model (paired tests behind the resource figures in Section 5.5.7).</w:t>
       </w:r>
     </w:p>
     <w:sectPr>

</xml_diff>

<commit_message>
Point the appendix captions at the sections that still exist
Every appendix table Chapter 5 cites does exist - all 33 are in
Appendix.docx - but fourteen of their captions still named the section
numbers Chapter 5 had before its subsections were merged to fit the page
limit. Four of those numbers, 5.1.9, 5.3.4, 5.5.6 and 5.5.7, no longer
existed at all; the rest pointed at a real section that does not discuss
the table.

Each caption now names the section that actually uses it, checked by
finding where the chapters cite the table rather than by guessing. Table
A.9 is left pointing at 4.1.3.1, which is where the judge selection
criteria belong even though 5.1.5 is what cites it.

No section reference anywhere in the draft now points at a heading that
does not exist.

Co-Authored-By: Claude Opus 5 (1M context) <noreply@anthropic.com>
</commit_message>
<xml_diff>
--- a/final writing/Appendix.docx
+++ b/final writing/Appendix.docx
@@ -12214,7 +12214,7 @@
         <w:rPr>
           <w:i/>
         </w:rPr>
-        <w:t>Table A.10: Design of the human-evaluation items (item-by-item design of the human study described in Section 5.1.9).</w:t>
+        <w:t>Table A.10: Design of the human-evaluation items (item-by-item design of the human study described in Section 5.1.6).</w:t>
       </w:r>
     </w:p>
     <w:tbl>
@@ -14526,7 +14526,7 @@
         <w:rPr>
           <w:i/>
         </w:rPr>
-        <w:t>Table A.13: Paired significance tests between the detector candidates (significance tests behind the detector comparison in Section 4.2.2).</w:t>
+        <w:t>Table A.13: Paired significance tests between the detector candidates (significance tests behind the detector comparison in Section 5.2.2).</w:t>
       </w:r>
     </w:p>
     <w:tbl>
@@ -17891,7 +17891,7 @@
         <w:rPr>
           <w:i/>
         </w:rPr>
-        <w:t>Table A.18: What the detector predicts as the window widens, on ten short conversations containing an emotion shift (the ten short emotion-shift conversations behind Section 5.3.4).</w:t>
+        <w:t>Table A.18: What the detector predicts as the window widens, on ten short conversations containing an emotion shift (the ten short emotion-shift conversations behind Section 5.3.2).</w:t>
       </w:r>
     </w:p>
     <w:tbl>
@@ -26900,7 +26900,7 @@
         <w:rPr>
           <w:i/>
         </w:rPr>
-        <w:t>Table A.21: A more accurate detector with the generator held fixed (detector-swap detail behind Section 5.5.3).</w:t>
+        <w:t>Table A.21: A more accurate detector with the generator held fixed (detector-swap detail behind Section 5.5.2).</w:t>
       </w:r>
     </w:p>
     <w:tbl>
@@ -30178,7 +30178,7 @@
         <w:rPr>
           <w:i/>
         </w:rPr>
-        <w:t>Table A.24: Evidence for and against the empathy classifier for this project (validity checks on the empathy classifier, summarised in Section 5.4.6).</w:t>
+        <w:t>Table A.24: Evidence for and against the empathy classifier for this project (validity checks on the empathy classifier, summarised in Section 5.4.4).</w:t>
       </w:r>
     </w:p>
     <w:tbl>
@@ -34387,7 +34387,7 @@
         <w:rPr>
           <w:i/>
         </w:rPr>
-        <w:t>Table A.25: Paired significance tests on the AI-judge scores (every judge comparison behind Section 5.4.6).</w:t>
+        <w:t>Table A.25: Paired significance tests on the AI-judge scores (every judge comparison behind Section 5.4.5).</w:t>
       </w:r>
     </w:p>
     <w:tbl>
@@ -35695,7 +35695,7 @@
         <w:rPr>
           <w:i/>
         </w:rPr>
-        <w:t>Table A.28: Reply quality against total parameters for the final system and the single models (the numbers behind the cost chart in Section 5.5.5).</w:t>
+        <w:t>Table A.28: Reply quality against total parameters for the final system and the single models (the numbers behind the cost chart in Section 5.5.3).</w:t>
       </w:r>
     </w:p>
     <w:tbl>
@@ -36114,7 +36114,7 @@
         <w:rPr>
           <w:i/>
         </w:rPr>
-        <w:t>Table A.29: Detector size, detection accuracy and the resulting reply quality (detector-level figures behind Section 5.5.7).</w:t>
+        <w:t>Table A.29: Detector size, detection accuracy and the resulting reply quality (detector-level figures behind Section 5.5.2).</w:t>
       </w:r>
     </w:p>
     <w:tbl>
@@ -36710,7 +36710,7 @@
         <w:rPr>
           <w:i/>
         </w:rPr>
-        <w:t>Table A.30: Peak GPU memory and response time on the same 50 conversations (memory and timing measurements behind Section 5.5.5).</w:t>
+        <w:t>Table A.30: Peak GPU memory and response time on the same 50 conversations (memory and timing measurements behind Section 5.5.3).</w:t>
       </w:r>
     </w:p>
     <w:tbl>
@@ -37678,7 +37678,7 @@
         <w:rPr>
           <w:i/>
         </w:rPr>
-        <w:t>Table A.31: Paired comparison of response time and memory against each single model (paired tests behind the resource figures in Section 5.5.7).</w:t>
+        <w:t>Table A.31: Paired comparison of response time and memory against each single model (paired tests behind the resource figures in Section 5.5.3).</w:t>
       </w:r>
     </w:p>
     <w:tbl>
@@ -37959,7 +37959,7 @@
         <w:rPr>
           <w:i/>
         </w:rPr>
-        <w:t>Table A.32: Origin of each response rule and its measured effect within systems (origin and measured effect of each rule, summarised in Section 5.5.6).</w:t>
+        <w:t>Table A.32: Origin of each response rule and its measured effect within systems (origin and measured effect of each rule, summarised in Section 5.5.4).</w:t>
       </w:r>
     </w:p>
     <w:tbl>
@@ -39579,7 +39579,7 @@
         <w:rPr>
           <w:i/>
         </w:rPr>
-        <w:t>Table A.33: The decoupled design against the same generator alone, with reply length held constant (the numbers behind the comparison in Section 5.5.7).</w:t>
+        <w:t>Table A.33: The decoupled design against the same generator alone, with reply length held constant (the numbers behind the comparison in Section 5.5.5).</w:t>
       </w:r>
     </w:p>
     <w:sectPr>

</xml_diff>